<commit_message>
docs(fabric): the cloud proof recorded — drawings, heatmap line and POC §8 as of sha-83ae1c0
Nine-step proof passes against the public gateway; the facade's embed/search/similar work there (nomic
via the gateway); every fabric service runs the pinned image. Still amber: no pilot library allow-listed
or subscribed, projector folder unset.

Co-Authored-By: Claude Fable 5.1 <noreply@anthropic.com>
Claude-Session: https://claude.ai/code/session_01EtGcqgehQqtKSUnysVd3WA
</commit_message>
<xml_diff>
--- a/docs/fabric/Documentation-Fabric-POC-v1.1.docx
+++ b/docs/fabric/Documentation-Fabric-POC-v1.1.docx
@@ -13430,27 +13430,27 @@
         <w:t>claude-haiku-4-5</w:t>
       </w:r>
       <w:r>
-        <w:t xml:space="preserve">. The cloud deploy is </w:t>
+        <w:t>. The cloud tier followed the same day (</w:t>
       </w:r>
       <w:r>
         <w:rPr>
           <w:rFonts w:ascii="Consolas" w:hAnsi="Consolas"/>
           <w:sz w:val="18"/>
         </w:rPr>
-        <w:t>substrate up</w:t>
+        <w:t>main</w:t>
       </w:r>
       <w:r>
-        <w:t xml:space="preserve"> (three daemons, the graph-mcp domain), </w:t>
+        <w:t xml:space="preserve"> at 83ae1c0 through CD, with </w:t>
       </w:r>
       <w:r>
         <w:rPr>
           <w:rFonts w:ascii="Consolas" w:hAnsi="Consolas"/>
           <w:sz w:val="18"/>
         </w:rPr>
-        <w:t>workload fabric-intake|artifact-publish up</w:t>
+        <w:t>LAB_ENV</w:t>
       </w:r>
       <w:r>
-        <w:t xml:space="preserve">, then </w:t>
+        <w:t xml:space="preserve"> refreshed): every fabric service runs the pinned image, semantic-mcp migrated the catalog tables in Neon at boot, and </w:t>
       </w:r>
       <w:r>
         <w:rPr>
@@ -13460,7 +13460,37 @@
         <w:t>fabric_demo.py</w:t>
       </w:r>
       <w:r>
-        <w:t xml:space="preserve"> against the public gateway.</w:t>
+        <w:t xml:space="preserve"> passes its nine checks against the public gateway. Two deploy defects surfaced and were fixed on the way: the contract must import without rdflib (CD's store-registration step has no semantic layer), and semantic-mcp needs </w:t>
+      </w:r>
+      <w:r>
+        <w:rPr>
+          <w:rFonts w:ascii="Consolas" w:hAnsi="Consolas"/>
+          <w:sz w:val="18"/>
+        </w:rPr>
+        <w:t>REDIS_URL</w:t>
+      </w:r>
+      <w:r>
+        <w:t xml:space="preserve"> for the rung store's index. What the cloud still lacks is a pilot library: </w:t>
+      </w:r>
+      <w:r>
+        <w:rPr>
+          <w:rFonts w:ascii="Consolas" w:hAnsi="Consolas"/>
+          <w:sz w:val="18"/>
+        </w:rPr>
+        <w:t>FABRIC_ALLOWLIST</w:t>
+      </w:r>
+      <w:r>
+        <w:t xml:space="preserve"> (which the reconciler sweeps and the ingress admits), a change-notification subscription on it, and </w:t>
+      </w:r>
+      <w:r>
+        <w:rPr>
+          <w:rFonts w:ascii="Consolas" w:hAnsi="Consolas"/>
+          <w:sz w:val="18"/>
+        </w:rPr>
+        <w:t>FABRIC_WIKI_FOLDER</w:t>
+      </w:r>
+      <w:r>
+        <w:t xml:space="preserve"> for the projector — three settings, no code.</w:t>
       </w:r>
     </w:p>
     <w:p>

</xml_diff>

<commit_message>
docs(fabric): the cloud loop on a real document, recorded — drawings green, POC §8, heatmap line
Co-Authored-By: Claude Fable 5.1 <noreply@anthropic.com>
Claude-Session: https://claude.ai/code/session_01EtGcqgehQqtKSUnysVd3WA
</commit_message>
<xml_diff>
--- a/docs/fabric/Documentation-Fabric-POC-v1.1.docx
+++ b/docs/fabric/Documentation-Fabric-POC-v1.1.docx
@@ -13470,7 +13470,7 @@
         <w:t>REDIS_URL</w:t>
       </w:r>
       <w:r>
-        <w:t xml:space="preserve"> for the rung store's index. What the cloud still lacks is a pilot library: </w:t>
+        <w:t xml:space="preserve"> for the rung store's index. With the pilot library set (</w:t>
       </w:r>
       <w:r>
         <w:rPr>
@@ -13480,7 +13480,17 @@
         <w:t>FABRIC_ALLOWLIST</w:t>
       </w:r>
       <w:r>
-        <w:t xml:space="preserve"> (which the reconciler sweeps and the ingress admits), a change-notification subscription on it, and </w:t>
+        <w:t xml:space="preserve"> = the </w:t>
+      </w:r>
+      <w:r>
+        <w:rPr>
+          <w:rFonts w:ascii="Consolas" w:hAnsi="Consolas"/>
+          <w:sz w:val="18"/>
+        </w:rPr>
+        <w:t>Documents</w:t>
+      </w:r>
+      <w:r>
+        <w:t xml:space="preserve"> library of the AI Use-Case Intake PoC site, </w:t>
       </w:r>
       <w:r>
         <w:rPr>
@@ -13490,7 +13500,97 @@
         <w:t>FABRIC_WIKI_FOLDER</w:t>
       </w:r>
       <w:r>
-        <w:t xml:space="preserve"> for the projector — three settings, no code.</w:t>
+        <w:t xml:space="preserve"> = its root, </w:t>
+      </w:r>
+      <w:r>
+        <w:rPr>
+          <w:rFonts w:ascii="Consolas" w:hAnsi="Consolas"/>
+          <w:sz w:val="18"/>
+        </w:rPr>
+        <w:t>FABRIC_NOTIFY_CLIENT_STATE</w:t>
+      </w:r>
+      <w:r>
+        <w:t xml:space="preserve">, and a </w:t>
+      </w:r>
+      <w:r>
+        <w:rPr>
+          <w:rFonts w:ascii="Consolas" w:hAnsi="Consolas"/>
+          <w:sz w:val="18"/>
+        </w:rPr>
+        <w:t>drives/&lt;id&gt;/root</w:t>
+      </w:r>
+      <w:r>
+        <w:t xml:space="preserve"> subscription to graph-mcp's public receiver), the cloud ran the whole loop on real documents the same afternoon: the reconciler's first sweep became four </w:t>
+      </w:r>
+      <w:r>
+        <w:rPr>
+          <w:rFonts w:ascii="Consolas" w:hAnsi="Consolas"/>
+          <w:sz w:val="18"/>
+        </w:rPr>
+        <w:t>artifact_intake</w:t>
+      </w:r>
+      <w:r>
+        <w:t xml:space="preserve"> runs and four association cards (the classifier honestly answered </w:t>
+      </w:r>
+      <w:r>
+        <w:rPr>
+          <w:rFonts w:ascii="Consolas" w:hAnsi="Consolas"/>
+          <w:sz w:val="18"/>
+        </w:rPr>
+        <w:t>unknown</w:t>
+      </w:r>
+      <w:r>
+        <w:t xml:space="preserve"> for a CSV); one card decided by a named person made the curator assert the type at H, released </w:t>
+      </w:r>
+      <w:r>
+        <w:rPr>
+          <w:rFonts w:ascii="Consolas" w:hAnsi="Consolas"/>
+          <w:sz w:val="18"/>
+        </w:rPr>
+        <w:t>artifact_publish</w:t>
+      </w:r>
+      <w:r>
+        <w:t xml:space="preserve"> (baseline = the item's modified stamp), and the projector wrote </w:t>
+      </w:r>
+      <w:r>
+        <w:rPr>
+          <w:rFonts w:ascii="Consolas" w:hAnsi="Consolas"/>
+          <w:sz w:val="18"/>
+        </w:rPr>
+        <w:t>01-sanity-3-csv.md</w:t>
+      </w:r>
+      <w:r>
+        <w:t xml:space="preserve"> into the library — whose own change notification reached the receiver and was dropped by the ingress as fabric-originated. Three more deploy defects surfaced and were fixed with tests on the way: the curator team lacked the collaboration verbs it acts with; a </w:t>
+      </w:r>
+      <w:r>
+        <w:rPr>
+          <w:rFonts w:ascii="Consolas" w:hAnsi="Consolas"/>
+          <w:sz w:val="18"/>
+        </w:rPr>
+        <w:t>::</w:t>
+      </w:r>
+      <w:r>
+        <w:t xml:space="preserve"> bind was IPv6-only, so the IPv4 public edge answered 502 and Graph refused the subscription until the server bound both stacks; and the ingress said nothing on a successful submit. Two operational notes: a deploy restarts the gateway while the reconciler sweeps at boot, so runs submitted in that window fail at preflight and are </w:t>
+      </w:r>
+      <w:r>
+        <w:rPr>
+          <w:rFonts w:ascii="Consolas" w:hAnsi="Consolas"/>
+          <w:sz w:val="18"/>
+        </w:rPr>
+        <w:t>workflow_replay</w:t>
+      </w:r>
+      <w:r>
+        <w:t xml:space="preserve">ed; drive subscriptions expire in three days and need </w:t>
+      </w:r>
+      <w:r>
+        <w:rPr>
+          <w:rFonts w:ascii="Consolas" w:hAnsi="Consolas"/>
+          <w:sz w:val="18"/>
+        </w:rPr>
+        <w:t>collab_watch_renew</w:t>
+      </w:r>
+      <w:r>
+        <w:t>.</w:t>
       </w:r>
     </w:p>
     <w:p>

</xml_diff>